<commit_message>
feat: add instructions for different question types in word template
</commit_message>
<xml_diff>
--- a/static/template_soal_ujian.docx
+++ b/static/template_soal_ujian.docx
@@ -22,7 +22,7 @@
     </w:p>
     <w:p>
       <w:r>
-        <w:t xml:space="preserve">- Gunakan penomoran huruf (A., B., C., D., E.) untuk opsi jawaban.</w:t>
+        <w:t xml:space="preserve">- Gunakan penomoran huruf (A., B., C., D., E.) untuk opsi jawaban (hanya Pilihan Ganda).</w:t>
       </w:r>
     </w:p>
     <w:p>
@@ -37,6 +37,40 @@
     </w:p>
     <w:p/>
     <w:p>
+      <w:pPr>
+        <w:pStyle w:val="Heading3"/>
+      </w:pPr>
+      <w:r>
+        <w:t xml:space="preserve">Cara Menulis Berbagai Tipe Soal:</w:t>
+      </w:r>
+    </w:p>
+    <w:p>
+      <w:r>
+        <w:t xml:space="preserve">- Pilihan Ganda: Tulis opsi A, B, C, D dan satu kunci (KUNCI: A)</w:t>
+      </w:r>
+    </w:p>
+    <w:p>
+      <w:r>
+        <w:t xml:space="preserve">- Pilihan Ganda Kompleks: Tulis opsi dan lebih dari satu kunci (KUNCI: A, C)</w:t>
+      </w:r>
+    </w:p>
+    <w:p>
+      <w:r>
+        <w:t xml:space="preserve">- Benar Salah: Jangan tulis opsi, langsung tulis (KUNCI: Benar atau KUNCI: Salah)</w:t>
+      </w:r>
+    </w:p>
+    <w:p>
+      <w:r>
+        <w:t xml:space="preserve">- Isian Singkat: Jangan tulis opsi, langsung tulis jawaban (KUNCI: Jawaban Anda)</w:t>
+      </w:r>
+    </w:p>
+    <w:p>
+      <w:r>
+        <w:t xml:space="preserve">- Esai: Jangan tulis opsi, langsung tulis (KUNCI: ESSAY)</w:t>
+      </w:r>
+    </w:p>
+    <w:p/>
+    <w:p>
       <w:r>
         <w:t xml:space="preserve">=================================================</w:t>
       </w:r>
@@ -121,27 +155,29 @@
     </w:p>
     <w:p>
       <w:r>
-        <w:t xml:space="preserve">A. Kucing</w:t>
-      </w:r>
-    </w:p>
-    <w:p>
-      <w:r>
-        <w:t xml:space="preserve">B. Anjing</w:t>
-      </w:r>
-    </w:p>
-    <w:p>
-      <w:r>
-        <w:t xml:space="preserve">C. Gajah</w:t>
-      </w:r>
-    </w:p>
-    <w:p>
-      <w:r>
-        <w:t xml:space="preserve">D. Jerapah</w:t>
-      </w:r>
-    </w:p>
-    <w:p>
-      <w:r>
-        <w:t xml:space="preserve">KUNCI: C</w:t>
+        <w:t xml:space="preserve">KUNCI: Gajah</w:t>
+      </w:r>
+    </w:p>
+    <w:p/>
+    <w:p>
+      <w:r>
+        <w:t xml:space="preserve">4. Apakah Matahari terbit dari timur?</w:t>
+      </w:r>
+    </w:p>
+    <w:p>
+      <w:r>
+        <w:t xml:space="preserve">KUNCI: Benar</w:t>
+      </w:r>
+    </w:p>
+    <w:p/>
+    <w:p>
+      <w:r>
+        <w:t xml:space="preserve">5. Sebutkan dan jelaskan proses terjadinya hujan!</w:t>
+      </w:r>
+    </w:p>
+    <w:p>
+      <w:r>
+        <w:t xml:space="preserve">KUNCI: ESSAY</w:t>
       </w:r>
     </w:p>
     <w:p/>

</xml_diff>